<commit_message>
Guide: record final WhatsApp setup (Colombia-only feed)
Co-Authored-By: Claude Opus 5.5 <noreply@anthropic.com>
Claude-Session: https://claude.ai/code/session_01AQvRoJbu3autEaEnC9DQeD
</commit_message>
<xml_diff>
--- a/docs/Guia_conectar_WhatsApp.docx
+++ b/docs/Guia_conectar_WhatsApp.docx
@@ -8,6 +8,14 @@
       </w:pPr>
       <w:r>
         <w:t>Conectar el catálogo de Cestoria a WhatsApp Business</w:t>
+      </w:r>
+    </w:p>
+    <w:p>
+      <w:r>
+        <w:rPr>
+          <w:b/>
+        </w:rPr>
+        <w:t>ESTADO FINAL (26-10-2026): se usa la OPCIÓN A, solo Colombia. La opción B se probó: WhatsApp Business no aplica las variantes por país (un cliente en Colombia veía productos de Perú y la tienda le mostraba «Producto no disponible»). Configuración activa: un único origen «Cestoria – Colombia» con la URL …/feed-whatsapp.csv, 36 productos, sin errores, se reemplaza diariamente; feeds de país eliminados; catálogo «Catálogo_Productos» conectado a WhatsApp Business +57 315 2424445.</w:t>
       </w:r>
     </w:p>
     <w:p>

</xml_diff>